<commit_message>
John Travolta: revisão da Parte 2
Co-Authored-By: Claude Opus 5.5 <noreply@anthropic.com>
Claude-Session: https://claude.ai/code/session_01MJjUEEZrxQDEUifKK2vj9g
</commit_message>
<xml_diff>
--- a/roteiros/john-travolta/Travolta_Parte2.docx
+++ b/roteiros/john-travolta/Travolta_Parte2.docx
@@ -31,7 +31,7 @@
         <w:rPr>
           <w:color w:val="000000"/>
         </w:rPr>
-        <w:t>Para Hollywood, era um casal improvável. Ele, o galã adolescente da televisão. Ela, uma atriz experiente, divorciada, mãe de um menino pequeno chamado Zachary.</w:t>
+        <w:t>Para Hollywood, era um casal improvável. Ele, o galã que fazia as adolescentes suspirarem na televisão. Ela, uma atriz experiente, divorciada, mãe de um menino pequeno chamado Zachary.</w:t>
       </w:r>
     </w:p>
     <w:p>
@@ -47,7 +47,7 @@
         <w:rPr>
           <w:color w:val="000000"/>
         </w:rPr>
-        <w:t>Diana, porém, carregava um peso que pouca gente conhecia.</w:t>
+        <w:t>Diana, porém, carregava um peso enorme.</w:t>
       </w:r>
     </w:p>
     <w:p>
@@ -263,7 +263,7 @@
         <w:rPr>
           <w:color w:val="000000"/>
         </w:rPr>
-        <w:t>Ninguém na plateia ia saber disso.</w:t>
+        <w:t>A maior parte da plateia nunca soube disso.</w:t>
       </w:r>
     </w:p>
     <w:p>
@@ -375,7 +375,7 @@
         <w:rPr>
           <w:color w:val="000000"/>
         </w:rPr>
-        <w:t>Lembra de Helen, a mãe de John? A mulher que colocou o filho caçula no caminho da fama?</w:t>
+        <w:t>Lembra de Helen, a mãe que colocou o filho caçula no caminho da fama?</w:t>
       </w:r>
     </w:p>
     <w:p>
@@ -408,14 +408,6 @@
           <w:color w:val="000000"/>
         </w:rPr>
         <w:t>A mãe que tinha sonhado com a fama e nunca chegou lá estava ali, dentro do filme que transformou o filho no homem mais famoso do planeta.</w:t>
-      </w:r>
-    </w:p>
-    <w:p>
-      <w:r>
-        <w:rPr>
-          <w:color w:val="000000"/>
-        </w:rPr>
-        <w:t>Foi o mais perto que Helen chegou da fama com que tinha sonhado na juventude.</w:t>
       </w:r>
     </w:p>
     <w:p>

</xml_diff>